<commit_message>
Add speaker notes, live links, and screenshot-embedded Word docs
- PPT: Speaker notes on all 11 slides + clickable live website and GitHub links on Slides 1 and 11
- Screenshots: 7 PNG screenshots of each website section taken via Selenium/Chrome headless
- Word docs: Regenerated all 4 Word docs with actual website screenshots embedded
- README: Added GitHub Pages live URL banner
- GitHub Pages: Enabled at https://omais-eng.github.io/assignment-04-rpa-bot-troubleshooting/

Co-Authored-By: Claude Sonnet 4.6 <noreply@anthropic.com>
</commit_message>
<xml_diff>
--- a/word-docs/Section_1_Error_Log.docx
+++ b/word-docs/Section_1_Error_Log.docx
@@ -11,14 +11,14 @@
         <w:rPr>
           <w:b/>
           <w:color w:val="1A3A5C"/>
-          <w:sz w:val="44"/>
+          <w:sz w:val="40"/>
         </w:rPr>
         <w:t>RPA Bot Troubleshooting — Section 1: Error Log</w:t>
       </w:r>
     </w:p>
     <w:p>
       <w:pPr>
-        <w:spacing w:after="240"/>
+        <w:spacing w:after="200"/>
         <w:jc w:val="center"/>
       </w:pPr>
       <w:r>
@@ -31,15 +31,206 @@
     </w:p>
     <w:p>
       <w:pPr>
-        <w:spacing w:before="240" w:after="120"/>
+        <w:spacing w:before="200" w:after="80"/>
       </w:pPr>
       <w:r>
         <w:rPr>
           <w:b/>
           <w:color w:val="1A3A5C"/>
-          <w:sz w:val="28"/>
+          <w:sz w:val="26"/>
         </w:rPr>
-        <w:t>5 Realistic RPA Exceptions — System, Business &amp; Application</w:t>
+        <w:t>Website Screenshot — Hero &amp; Error Log Section</w:t>
+      </w:r>
+    </w:p>
+    <w:p>
+      <w:pPr>
+        <w:jc w:val="center"/>
+      </w:pPr>
+      <w:r>
+        <w:drawing>
+          <wp:inline xmlns:a="http://schemas.openxmlformats.org/drawingml/2006/main" xmlns:pic="http://schemas.openxmlformats.org/drawingml/2006/picture">
+            <wp:extent cx="5943600" cy="3232186"/>
+            <wp:docPr id="1" name="Picture 1"/>
+            <wp:cNvGraphicFramePr>
+              <a:graphicFrameLocks noChangeAspect="1"/>
+            </wp:cNvGraphicFramePr>
+            <a:graphic>
+              <a:graphicData uri="http://schemas.openxmlformats.org/drawingml/2006/picture">
+                <pic:pic>
+                  <pic:nvPicPr>
+                    <pic:cNvPr id="0" name="01_Hero_Banner.png"/>
+                    <pic:cNvPicPr/>
+                  </pic:nvPicPr>
+                  <pic:blipFill>
+                    <a:blip r:embed="rId9"/>
+                    <a:stretch>
+                      <a:fillRect/>
+                    </a:stretch>
+                  </pic:blipFill>
+                  <pic:spPr>
+                    <a:xfrm>
+                      <a:off x="0" y="0"/>
+                      <a:ext cx="5943600" cy="3232186"/>
+                    </a:xfrm>
+                    <a:prstGeom prst="rect"/>
+                  </pic:spPr>
+                </pic:pic>
+              </a:graphicData>
+            </a:graphic>
+          </wp:inline>
+        </w:drawing>
+      </w:r>
+    </w:p>
+    <w:p>
+      <w:pPr>
+        <w:spacing w:after="200"/>
+        <w:jc w:val="center"/>
+      </w:pPr>
+      <w:r>
+        <w:rPr>
+          <w:i/>
+          <w:color w:val="64748B"/>
+          <w:sz w:val="18"/>
+        </w:rPr>
+        <w:t>Figure 1: Website Hero Banner — RPA Bot Troubleshooting Case Study</w:t>
+      </w:r>
+    </w:p>
+    <w:p>
+      <w:pPr>
+        <w:jc w:val="center"/>
+      </w:pPr>
+      <w:r>
+        <w:drawing>
+          <wp:inline xmlns:a="http://schemas.openxmlformats.org/drawingml/2006/main" xmlns:pic="http://schemas.openxmlformats.org/drawingml/2006/picture">
+            <wp:extent cx="5943600" cy="3232186"/>
+            <wp:docPr id="2" name="Picture 2"/>
+            <wp:cNvGraphicFramePr>
+              <a:graphicFrameLocks noChangeAspect="1"/>
+            </wp:cNvGraphicFramePr>
+            <a:graphic>
+              <a:graphicData uri="http://schemas.openxmlformats.org/drawingml/2006/picture">
+                <pic:pic>
+                  <pic:nvPicPr>
+                    <pic:cNvPr id="0" name="02_Section1_Errors.png"/>
+                    <pic:cNvPicPr/>
+                  </pic:nvPicPr>
+                  <pic:blipFill>
+                    <a:blip r:embed="rId10"/>
+                    <a:stretch>
+                      <a:fillRect/>
+                    </a:stretch>
+                  </pic:blipFill>
+                  <pic:spPr>
+                    <a:xfrm>
+                      <a:off x="0" y="0"/>
+                      <a:ext cx="5943600" cy="3232186"/>
+                    </a:xfrm>
+                    <a:prstGeom prst="rect"/>
+                  </pic:spPr>
+                </pic:pic>
+              </a:graphicData>
+            </a:graphic>
+          </wp:inline>
+        </w:drawing>
+      </w:r>
+    </w:p>
+    <w:p>
+      <w:pPr>
+        <w:spacing w:after="200"/>
+        <w:jc w:val="center"/>
+      </w:pPr>
+      <w:r>
+        <w:rPr>
+          <w:i/>
+          <w:color w:val="64748B"/>
+          <w:sz w:val="18"/>
+        </w:rPr>
+        <w:t>Figure 2: Section 1 — RPA Error Log Table (5 exceptions)</w:t>
+      </w:r>
+    </w:p>
+    <w:p>
+      <w:r>
+        <w:br w:type="page"/>
+      </w:r>
+    </w:p>
+    <w:p>
+      <w:pPr>
+        <w:spacing w:before="200" w:after="80"/>
+      </w:pPr>
+      <w:r>
+        <w:rPr>
+          <w:b/>
+          <w:color w:val="1A3A5C"/>
+          <w:sz w:val="26"/>
+        </w:rPr>
+        <w:t>5 Realistic RPA Exceptions — Descriptions</w:t>
+      </w:r>
+    </w:p>
+    <w:p>
+      <w:pPr>
+        <w:spacing w:before="200" w:after="80"/>
+      </w:pPr>
+      <w:r>
+        <w:rPr>
+          <w:b/>
+          <w:color w:val="2563EB"/>
+          <w:sz w:val="26"/>
+        </w:rPr>
+        <w:t>E-01 — SelectorNotFoundException</w:t>
+      </w:r>
+    </w:p>
+    <w:p>
+      <w:pPr>
+        <w:spacing w:after="40"/>
+      </w:pPr>
+      <w:r>
+        <w:rPr>
+          <w:b/>
+          <w:sz w:val="21"/>
+        </w:rPr>
+        <w:t xml:space="preserve">Type: </w:t>
+      </w:r>
+      <w:r>
+        <w:rPr>
+          <w:sz w:val="21"/>
+        </w:rPr>
+        <w:t>System</w:t>
+      </w:r>
+    </w:p>
+    <w:p>
+      <w:pPr>
+        <w:spacing w:after="40"/>
+      </w:pPr>
+      <w:r>
+        <w:rPr>
+          <w:b/>
+          <w:sz w:val="21"/>
+        </w:rPr>
+        <w:t xml:space="preserve">Stage: </w:t>
+      </w:r>
+      <w:r>
+        <w:rPr>
+          <w:sz w:val="21"/>
+        </w:rPr>
+        <w:t>Order Placement</w:t>
+      </w:r>
+    </w:p>
+    <w:p>
+      <w:pPr>
+        <w:spacing w:after="40"/>
+      </w:pPr>
+      <w:r>
+        <w:rPr>
+          <w:b/>
+          <w:sz w:val="21"/>
+        </w:rPr>
+        <w:t xml:space="preserve">Severity: </w:t>
+      </w:r>
+      <w:r>
+        <w:rPr>
+          <w:sz w:val="21"/>
+        </w:rPr>
+        <w:t>HIGH</w:t>
       </w:r>
     </w:p>
     <w:p>
@@ -48,876 +239,326 @@
       </w:pPr>
       <w:r>
         <w:rPr>
-          <w:b w:val="0"/>
-          <w:sz w:val="20"/>
+          <w:sz w:val="21"/>
         </w:rPr>
-        <w:t>The following table documents five realistic exceptions encountered by the E-Commerce Order Processing RPA Bot. Each error is categorized by type, workflow stage, business impact, and root cause.</w:t>
+        <w:t>Root Cause: Checkout portal frontend renamed CSS selector from #btn-checkout to .submit-order-cta during a release. The bot's selector library was not updated. This blocked approximately 120 orders per hour.</w:t>
       </w:r>
     </w:p>
-    <w:tbl>
-      <w:tblPr>
-        <w:tblStyle w:val="TableGrid"/>
-        <w:tblW w:type="auto" w:w="0"/>
-        <w:tblLook w:firstColumn="1" w:firstRow="1" w:lastColumn="0" w:lastRow="0" w:noHBand="0" w:noVBand="1" w:val="04A0"/>
-      </w:tblPr>
-      <w:tblGrid>
-        <w:gridCol w:w="1934"/>
-        <w:gridCol w:w="1934"/>
-        <w:gridCol w:w="1934"/>
-        <w:gridCol w:w="1934"/>
-        <w:gridCol w:w="1934"/>
-        <w:gridCol w:w="1934"/>
-        <w:gridCol w:w="1934"/>
-      </w:tblGrid>
-      <w:tr>
-        <w:tc>
-          <w:tcPr>
-            <w:tcW w:type="dxa" w:w="648"/>
-            <w:shd w:val="clear" w:color="auto" w:fill="1a3a5c"/>
-          </w:tcPr>
-          <w:p>
-            <w:pPr>
-              <w:jc w:val="center"/>
-            </w:pPr>
-            <w:r>
-              <w:rPr>
-                <w:b/>
-                <w:color w:val="FFFFFF"/>
-                <w:sz w:val="19"/>
-              </w:rPr>
-              <w:t>#</w:t>
-            </w:r>
-          </w:p>
-        </w:tc>
-        <w:tc>
-          <w:tcPr>
-            <w:tcW w:type="dxa" w:w="2736"/>
-            <w:shd w:val="clear" w:color="auto" w:fill="1a3a5c"/>
-          </w:tcPr>
-          <w:p>
-            <w:pPr>
-              <w:jc w:val="center"/>
-            </w:pPr>
-            <w:r>
-              <w:rPr>
-                <w:b/>
-                <w:color w:val="FFFFFF"/>
-                <w:sz w:val="19"/>
-              </w:rPr>
-              <w:t>Error Name</w:t>
-            </w:r>
-          </w:p>
-        </w:tc>
-        <w:tc>
-          <w:tcPr>
-            <w:tcW w:type="dxa" w:w="1080"/>
-            <w:shd w:val="clear" w:color="auto" w:fill="1a3a5c"/>
-          </w:tcPr>
-          <w:p>
-            <w:pPr>
-              <w:jc w:val="center"/>
-            </w:pPr>
-            <w:r>
-              <w:rPr>
-                <w:b/>
-                <w:color w:val="FFFFFF"/>
-                <w:sz w:val="19"/>
-              </w:rPr>
-              <w:t>Type</w:t>
-            </w:r>
-          </w:p>
-        </w:tc>
-        <w:tc>
-          <w:tcPr>
-            <w:tcW w:type="dxa" w:w="1584"/>
-            <w:shd w:val="clear" w:color="auto" w:fill="1a3a5c"/>
-          </w:tcPr>
-          <w:p>
-            <w:pPr>
-              <w:jc w:val="center"/>
-            </w:pPr>
-            <w:r>
-              <w:rPr>
-                <w:b/>
-                <w:color w:val="FFFFFF"/>
-                <w:sz w:val="19"/>
-              </w:rPr>
-              <w:t>Stage</w:t>
-            </w:r>
-          </w:p>
-        </w:tc>
-        <w:tc>
-          <w:tcPr>
-            <w:tcW w:type="dxa" w:w="2592"/>
-            <w:shd w:val="clear" w:color="auto" w:fill="1a3a5c"/>
-          </w:tcPr>
-          <w:p>
-            <w:pPr>
-              <w:jc w:val="center"/>
-            </w:pPr>
-            <w:r>
-              <w:rPr>
-                <w:b/>
-                <w:color w:val="FFFFFF"/>
-                <w:sz w:val="19"/>
-              </w:rPr>
-              <w:t>Impact</w:t>
-            </w:r>
-          </w:p>
-        </w:tc>
-        <w:tc>
-          <w:tcPr>
-            <w:tcW w:type="dxa" w:w="4032"/>
-            <w:shd w:val="clear" w:color="auto" w:fill="1a3a5c"/>
-          </w:tcPr>
-          <w:p>
-            <w:pPr>
-              <w:jc w:val="center"/>
-            </w:pPr>
-            <w:r>
-              <w:rPr>
-                <w:b/>
-                <w:color w:val="FFFFFF"/>
-                <w:sz w:val="19"/>
-              </w:rPr>
-              <w:t>Root Cause</w:t>
-            </w:r>
-          </w:p>
-        </w:tc>
-        <w:tc>
-          <w:tcPr>
-            <w:tcW w:type="dxa" w:w="1080"/>
-            <w:shd w:val="clear" w:color="auto" w:fill="1a3a5c"/>
-          </w:tcPr>
-          <w:p>
-            <w:pPr>
-              <w:jc w:val="center"/>
-            </w:pPr>
-            <w:r>
-              <w:rPr>
-                <w:b/>
-                <w:color w:val="FFFFFF"/>
-                <w:sz w:val="19"/>
-              </w:rPr>
-              <w:t>Severity</w:t>
-            </w:r>
-          </w:p>
-        </w:tc>
-      </w:tr>
-      <w:tr>
-        <w:tc>
-          <w:tcPr>
-            <w:tcW w:type="dxa" w:w="648"/>
-            <w:shd w:val="clear" w:color="auto" w:fill="ffffff"/>
-          </w:tcPr>
-          <w:p>
-            <w:pPr>
-              <w:jc w:val="center"/>
-            </w:pPr>
-            <w:r>
-              <w:rPr>
-                <w:b/>
-                <w:color w:val="1A3A5C"/>
-                <w:sz w:val="18"/>
-              </w:rPr>
-              <w:t>E-01</w:t>
-            </w:r>
-          </w:p>
-        </w:tc>
-        <w:tc>
-          <w:tcPr>
-            <w:tcW w:type="dxa" w:w="2736"/>
-            <w:shd w:val="clear" w:color="auto" w:fill="ffffff"/>
-          </w:tcPr>
-          <w:p>
-            <w:pPr>
-              <w:jc w:val="left"/>
-            </w:pPr>
-            <w:r>
-              <w:rPr>
-                <w:b/>
-                <w:color w:val="1A3A5C"/>
-                <w:sz w:val="18"/>
-              </w:rPr>
-              <w:t>SelectorNotFoundException</w:t>
-            </w:r>
-          </w:p>
-        </w:tc>
-        <w:tc>
-          <w:tcPr>
-            <w:tcW w:type="dxa" w:w="1080"/>
-            <w:shd w:val="clear" w:color="auto" w:fill="dbeafe"/>
-          </w:tcPr>
-          <w:p>
-            <w:pPr>
-              <w:jc w:val="center"/>
-            </w:pPr>
-            <w:r>
-              <w:rPr>
-                <w:b/>
-                <w:color w:val="2563EB"/>
-                <w:sz w:val="18"/>
-              </w:rPr>
-              <w:t>System</w:t>
-            </w:r>
-          </w:p>
-        </w:tc>
-        <w:tc>
-          <w:tcPr>
-            <w:tcW w:type="dxa" w:w="1584"/>
-            <w:shd w:val="clear" w:color="auto" w:fill="ffffff"/>
-          </w:tcPr>
-          <w:p>
-            <w:pPr>
-              <w:jc w:val="left"/>
-            </w:pPr>
-            <w:r>
-              <w:rPr>
-                <w:b w:val="0"/>
-                <w:sz w:val="18"/>
-              </w:rPr>
-              <w:t>Order Placement</w:t>
-            </w:r>
-          </w:p>
-        </w:tc>
-        <w:tc>
-          <w:tcPr>
-            <w:tcW w:type="dxa" w:w="2592"/>
-            <w:shd w:val="clear" w:color="auto" w:fill="ffffff"/>
-          </w:tcPr>
-          <w:p>
-            <w:pPr>
-              <w:jc w:val="left"/>
-            </w:pPr>
-            <w:r>
-              <w:rPr>
-                <w:b w:val="0"/>
-                <w:sz w:val="18"/>
-              </w:rPr>
-              <w:t>~120 orders/hr blocked; orders never submitted</w:t>
-            </w:r>
-          </w:p>
-        </w:tc>
-        <w:tc>
-          <w:tcPr>
-            <w:tcW w:type="dxa" w:w="4032"/>
-            <w:shd w:val="clear" w:color="auto" w:fill="ffffff"/>
-          </w:tcPr>
-          <w:p>
-            <w:pPr>
-              <w:jc w:val="left"/>
-            </w:pPr>
-            <w:r>
-              <w:rPr>
-                <w:b w:val="0"/>
-                <w:sz w:val="18"/>
-              </w:rPr>
-              <w:t>Checkout portal frontend renamed CSS selector from #btn-checkout to .submit-order-cta during a release. Selector library not updated.</w:t>
-            </w:r>
-          </w:p>
-        </w:tc>
-        <w:tc>
-          <w:tcPr>
-            <w:tcW w:type="dxa" w:w="1080"/>
-            <w:shd w:val="clear" w:color="auto" w:fill="fee2e2"/>
-          </w:tcPr>
-          <w:p>
-            <w:pPr>
-              <w:jc w:val="center"/>
-            </w:pPr>
-            <w:r>
-              <w:rPr>
-                <w:b/>
-                <w:color w:val="EF4444"/>
-                <w:sz w:val="18"/>
-              </w:rPr>
-              <w:t>HIGH</w:t>
-            </w:r>
-          </w:p>
-        </w:tc>
-      </w:tr>
-      <w:tr>
-        <w:tc>
-          <w:tcPr>
-            <w:tcW w:type="dxa" w:w="648"/>
-            <w:shd w:val="clear" w:color="auto" w:fill="f8fafc"/>
-          </w:tcPr>
-          <w:p>
-            <w:pPr>
-              <w:jc w:val="center"/>
-            </w:pPr>
-            <w:r>
-              <w:rPr>
-                <w:b/>
-                <w:color w:val="1A3A5C"/>
-                <w:sz w:val="18"/>
-              </w:rPr>
-              <w:t>E-02</w:t>
-            </w:r>
-          </w:p>
-        </w:tc>
-        <w:tc>
-          <w:tcPr>
-            <w:tcW w:type="dxa" w:w="2736"/>
-            <w:shd w:val="clear" w:color="auto" w:fill="f8fafc"/>
-          </w:tcPr>
-          <w:p>
-            <w:pPr>
-              <w:jc w:val="left"/>
-            </w:pPr>
-            <w:r>
-              <w:rPr>
-                <w:b/>
-                <w:color w:val="1A3A5C"/>
-                <w:sz w:val="18"/>
-              </w:rPr>
-              <w:t>InvalidOrderDataException</w:t>
-            </w:r>
-          </w:p>
-        </w:tc>
-        <w:tc>
-          <w:tcPr>
-            <w:tcW w:type="dxa" w:w="1080"/>
-            <w:shd w:val="clear" w:color="auto" w:fill="fef3c7"/>
-          </w:tcPr>
-          <w:p>
-            <w:pPr>
-              <w:jc w:val="center"/>
-            </w:pPr>
-            <w:r>
-              <w:rPr>
-                <w:b/>
-                <w:color w:val="92400E"/>
-                <w:sz w:val="18"/>
-              </w:rPr>
-              <w:t>Business</w:t>
-            </w:r>
-          </w:p>
-        </w:tc>
-        <w:tc>
-          <w:tcPr>
-            <w:tcW w:type="dxa" w:w="1584"/>
-            <w:shd w:val="clear" w:color="auto" w:fill="f8fafc"/>
-          </w:tcPr>
-          <w:p>
-            <w:pPr>
-              <w:jc w:val="left"/>
-            </w:pPr>
-            <w:r>
-              <w:rPr>
-                <w:b w:val="0"/>
-                <w:sz w:val="18"/>
-              </w:rPr>
-              <w:t>Data Extraction</w:t>
-            </w:r>
-          </w:p>
-        </w:tc>
-        <w:tc>
-          <w:tcPr>
-            <w:tcW w:type="dxa" w:w="2592"/>
-            <w:shd w:val="clear" w:color="auto" w:fill="f8fafc"/>
-          </w:tcPr>
-          <w:p>
-            <w:pPr>
-              <w:jc w:val="left"/>
-            </w:pPr>
-            <w:r>
-              <w:rPr>
-                <w:b w:val="0"/>
-                <w:sz w:val="18"/>
-              </w:rPr>
-              <w:t>Orders with missing ZIP codes cause failed shipments and customer complaints</w:t>
-            </w:r>
-          </w:p>
-        </w:tc>
-        <w:tc>
-          <w:tcPr>
-            <w:tcW w:type="dxa" w:w="4032"/>
-            <w:shd w:val="clear" w:color="auto" w:fill="f8fafc"/>
-          </w:tcPr>
-          <w:p>
-            <w:pPr>
-              <w:jc w:val="left"/>
-            </w:pPr>
-            <w:r>
-              <w:rPr>
-                <w:b w:val="0"/>
-                <w:sz w:val="18"/>
-              </w:rPr>
-              <w:t>ERP system began exporting international orders without postal code field. Input schema validation layer never updated.</w:t>
-            </w:r>
-          </w:p>
-        </w:tc>
-        <w:tc>
-          <w:tcPr>
-            <w:tcW w:type="dxa" w:w="1080"/>
-            <w:shd w:val="clear" w:color="auto" w:fill="fee2e2"/>
-          </w:tcPr>
-          <w:p>
-            <w:pPr>
-              <w:jc w:val="center"/>
-            </w:pPr>
-            <w:r>
-              <w:rPr>
-                <w:b/>
-                <w:color w:val="EF4444"/>
-                <w:sz w:val="18"/>
-              </w:rPr>
-              <w:t>HIGH</w:t>
-            </w:r>
-          </w:p>
-        </w:tc>
-      </w:tr>
-      <w:tr>
-        <w:tc>
-          <w:tcPr>
-            <w:tcW w:type="dxa" w:w="648"/>
-            <w:shd w:val="clear" w:color="auto" w:fill="ffffff"/>
-          </w:tcPr>
-          <w:p>
-            <w:pPr>
-              <w:jc w:val="center"/>
-            </w:pPr>
-            <w:r>
-              <w:rPr>
-                <w:b/>
-                <w:color w:val="1A3A5C"/>
-                <w:sz w:val="18"/>
-              </w:rPr>
-              <w:t>E-03</w:t>
-            </w:r>
-          </w:p>
-        </w:tc>
-        <w:tc>
-          <w:tcPr>
-            <w:tcW w:type="dxa" w:w="2736"/>
-            <w:shd w:val="clear" w:color="auto" w:fill="ffffff"/>
-          </w:tcPr>
-          <w:p>
-            <w:pPr>
-              <w:jc w:val="left"/>
-            </w:pPr>
-            <w:r>
-              <w:rPr>
-                <w:b/>
-                <w:color w:val="1A3A5C"/>
-                <w:sz w:val="18"/>
-              </w:rPr>
-              <w:t>OracleDBTimeoutException</w:t>
-            </w:r>
-          </w:p>
-        </w:tc>
-        <w:tc>
-          <w:tcPr>
-            <w:tcW w:type="dxa" w:w="1080"/>
-            <w:shd w:val="clear" w:color="auto" w:fill="dbeafe"/>
-          </w:tcPr>
-          <w:p>
-            <w:pPr>
-              <w:jc w:val="center"/>
-            </w:pPr>
-            <w:r>
-              <w:rPr>
-                <w:b/>
-                <w:color w:val="2563EB"/>
-                <w:sz w:val="18"/>
-              </w:rPr>
-              <w:t>System</w:t>
-            </w:r>
-          </w:p>
-        </w:tc>
-        <w:tc>
-          <w:tcPr>
-            <w:tcW w:type="dxa" w:w="1584"/>
-            <w:shd w:val="clear" w:color="auto" w:fill="ffffff"/>
-          </w:tcPr>
-          <w:p>
-            <w:pPr>
-              <w:jc w:val="left"/>
-            </w:pPr>
-            <w:r>
-              <w:rPr>
-                <w:b w:val="0"/>
-                <w:sz w:val="18"/>
-              </w:rPr>
-              <w:t>Inventory Check</w:t>
-            </w:r>
-          </w:p>
-        </w:tc>
-        <w:tc>
-          <w:tcPr>
-            <w:tcW w:type="dxa" w:w="2592"/>
-            <w:shd w:val="clear" w:color="auto" w:fill="ffffff"/>
-          </w:tcPr>
-          <w:p>
-            <w:pPr>
-              <w:jc w:val="left"/>
-            </w:pPr>
-            <w:r>
-              <w:rPr>
-                <w:b w:val="0"/>
-                <w:sz w:val="18"/>
-              </w:rPr>
-              <w:t>400+ units oversold per week; orders proceed without stock confirmation</w:t>
-            </w:r>
-          </w:p>
-        </w:tc>
-        <w:tc>
-          <w:tcPr>
-            <w:tcW w:type="dxa" w:w="4032"/>
-            <w:shd w:val="clear" w:color="auto" w:fill="ffffff"/>
-          </w:tcPr>
-          <w:p>
-            <w:pPr>
-              <w:jc w:val="left"/>
-            </w:pPr>
-            <w:r>
-              <w:rPr>
-                <w:b w:val="0"/>
-                <w:sz w:val="18"/>
-              </w:rPr>
-              <w:t>Inventory table lacks composite index on product_sku + warehouse_id. Full table scans under 50+ concurrent bots cause 30s timeouts.</w:t>
-            </w:r>
-          </w:p>
-        </w:tc>
-        <w:tc>
-          <w:tcPr>
-            <w:tcW w:type="dxa" w:w="1080"/>
-            <w:shd w:val="clear" w:color="auto" w:fill="fee2e2"/>
-          </w:tcPr>
-          <w:p>
-            <w:pPr>
-              <w:jc w:val="center"/>
-            </w:pPr>
-            <w:r>
-              <w:rPr>
-                <w:b/>
-                <w:color w:val="EF4444"/>
-                <w:sz w:val="18"/>
-              </w:rPr>
-              <w:t>HIGH</w:t>
-            </w:r>
-          </w:p>
-        </w:tc>
-      </w:tr>
-      <w:tr>
-        <w:tc>
-          <w:tcPr>
-            <w:tcW w:type="dxa" w:w="648"/>
-            <w:shd w:val="clear" w:color="auto" w:fill="f8fafc"/>
-          </w:tcPr>
-          <w:p>
-            <w:pPr>
-              <w:jc w:val="center"/>
-            </w:pPr>
-            <w:r>
-              <w:rPr>
-                <w:b/>
-                <w:color w:val="1A3A5C"/>
-                <w:sz w:val="18"/>
-              </w:rPr>
-              <w:t>E-04</w:t>
-            </w:r>
-          </w:p>
-        </w:tc>
-        <w:tc>
-          <w:tcPr>
-            <w:tcW w:type="dxa" w:w="2736"/>
-            <w:shd w:val="clear" w:color="auto" w:fill="f8fafc"/>
-          </w:tcPr>
-          <w:p>
-            <w:pPr>
-              <w:jc w:val="left"/>
-            </w:pPr>
-            <w:r>
-              <w:rPr>
-                <w:b/>
-                <w:color w:val="1A3A5C"/>
-                <w:sz w:val="18"/>
-              </w:rPr>
-              <w:t>DuplicateOrderException</w:t>
-            </w:r>
-          </w:p>
-        </w:tc>
-        <w:tc>
-          <w:tcPr>
-            <w:tcW w:type="dxa" w:w="1080"/>
-            <w:shd w:val="clear" w:color="auto" w:fill="fef3c7"/>
-          </w:tcPr>
-          <w:p>
-            <w:pPr>
-              <w:jc w:val="center"/>
-            </w:pPr>
-            <w:r>
-              <w:rPr>
-                <w:b/>
-                <w:color w:val="92400E"/>
-                <w:sz w:val="18"/>
-              </w:rPr>
-              <w:t>Business</w:t>
-            </w:r>
-          </w:p>
-        </w:tc>
-        <w:tc>
-          <w:tcPr>
-            <w:tcW w:type="dxa" w:w="1584"/>
-            <w:shd w:val="clear" w:color="auto" w:fill="f8fafc"/>
-          </w:tcPr>
-          <w:p>
-            <w:pPr>
-              <w:jc w:val="left"/>
-            </w:pPr>
-            <w:r>
-              <w:rPr>
-                <w:b w:val="0"/>
-                <w:sz w:val="18"/>
-              </w:rPr>
-              <w:t>Order Submission</w:t>
-            </w:r>
-          </w:p>
-        </w:tc>
-        <w:tc>
-          <w:tcPr>
-            <w:tcW w:type="dxa" w:w="2592"/>
-            <w:shd w:val="clear" w:color="auto" w:fill="f8fafc"/>
-          </w:tcPr>
-          <w:p>
-            <w:pPr>
-              <w:jc w:val="left"/>
-            </w:pPr>
-            <w:r>
-              <w:rPr>
-                <w:b w:val="0"/>
-                <w:sz w:val="18"/>
-              </w:rPr>
-              <w:t>Customers charged twice; 2-3 hrs/incident manual correction in finance</w:t>
-            </w:r>
-          </w:p>
-        </w:tc>
-        <w:tc>
-          <w:tcPr>
-            <w:tcW w:type="dxa" w:w="4032"/>
-            <w:shd w:val="clear" w:color="auto" w:fill="f8fafc"/>
-          </w:tcPr>
-          <w:p>
-            <w:pPr>
-              <w:jc w:val="left"/>
-            </w:pPr>
-            <w:r>
-              <w:rPr>
-                <w:b w:val="0"/>
-                <w:sz w:val="18"/>
-              </w:rPr>
-              <w:t>Retry logic lacked idempotency key check. On network timeout, bot retried without checking if original POST succeeded — creating duplicates.</w:t>
-            </w:r>
-          </w:p>
-        </w:tc>
-        <w:tc>
-          <w:tcPr>
-            <w:tcW w:type="dxa" w:w="1080"/>
-            <w:shd w:val="clear" w:color="auto" w:fill="fef3c7"/>
-          </w:tcPr>
-          <w:p>
-            <w:pPr>
-              <w:jc w:val="center"/>
-            </w:pPr>
-            <w:r>
-              <w:rPr>
-                <w:b/>
-                <w:color w:val="92400E"/>
-                <w:sz w:val="18"/>
-              </w:rPr>
-              <w:t>MEDIUM</w:t>
-            </w:r>
-          </w:p>
-        </w:tc>
-      </w:tr>
-      <w:tr>
-        <w:tc>
-          <w:tcPr>
-            <w:tcW w:type="dxa" w:w="648"/>
-            <w:shd w:val="clear" w:color="auto" w:fill="ffffff"/>
-          </w:tcPr>
-          <w:p>
-            <w:pPr>
-              <w:jc w:val="center"/>
-            </w:pPr>
-            <w:r>
-              <w:rPr>
-                <w:b/>
-                <w:color w:val="1A3A5C"/>
-                <w:sz w:val="18"/>
-              </w:rPr>
-              <w:t>E-05</w:t>
-            </w:r>
-          </w:p>
-        </w:tc>
-        <w:tc>
-          <w:tcPr>
-            <w:tcW w:type="dxa" w:w="2736"/>
-            <w:shd w:val="clear" w:color="auto" w:fill="ffffff"/>
-          </w:tcPr>
-          <w:p>
-            <w:pPr>
-              <w:jc w:val="left"/>
-            </w:pPr>
-            <w:r>
-              <w:rPr>
-                <w:b/>
-                <w:color w:val="1A3A5C"/>
-                <w:sz w:val="18"/>
-              </w:rPr>
-              <w:t>PDFParsingFailureException</w:t>
-            </w:r>
-          </w:p>
-        </w:tc>
-        <w:tc>
-          <w:tcPr>
-            <w:tcW w:type="dxa" w:w="1080"/>
-            <w:shd w:val="clear" w:color="auto" w:fill="ede9fe"/>
-          </w:tcPr>
-          <w:p>
-            <w:pPr>
-              <w:jc w:val="center"/>
-            </w:pPr>
-            <w:r>
-              <w:rPr>
-                <w:b/>
-                <w:color w:val="5B21B6"/>
-                <w:sz w:val="18"/>
-              </w:rPr>
-              <w:t>App</w:t>
-            </w:r>
-          </w:p>
-        </w:tc>
-        <w:tc>
-          <w:tcPr>
-            <w:tcW w:type="dxa" w:w="1584"/>
-            <w:shd w:val="clear" w:color="auto" w:fill="ffffff"/>
-          </w:tcPr>
-          <w:p>
-            <w:pPr>
-              <w:jc w:val="left"/>
-            </w:pPr>
-            <w:r>
-              <w:rPr>
-                <w:b w:val="0"/>
-                <w:sz w:val="18"/>
-              </w:rPr>
-              <w:t>Invoice Generation</w:t>
-            </w:r>
-          </w:p>
-        </w:tc>
-        <w:tc>
-          <w:tcPr>
-            <w:tcW w:type="dxa" w:w="2592"/>
-            <w:shd w:val="clear" w:color="auto" w:fill="ffffff"/>
-          </w:tcPr>
-          <w:p>
-            <w:pPr>
-              <w:jc w:val="left"/>
-            </w:pPr>
-            <w:r>
-              <w:rPr>
-                <w:b w:val="0"/>
-                <w:sz w:val="18"/>
-              </w:rPr>
-              <w:t>15% of daily invoices require manual re-generation; 1.5 hr/day overhead</w:t>
-            </w:r>
-          </w:p>
-        </w:tc>
-        <w:tc>
-          <w:tcPr>
-            <w:tcW w:type="dxa" w:w="4032"/>
-            <w:shd w:val="clear" w:color="auto" w:fill="ffffff"/>
-          </w:tcPr>
-          <w:p>
-            <w:pPr>
-              <w:jc w:val="left"/>
-            </w:pPr>
-            <w:r>
-              <w:rPr>
-                <w:b w:val="0"/>
-                <w:sz w:val="18"/>
-              </w:rPr>
-              <w:t>Vendor switched invoice template from text-layer PDF to scanned image PDF. OCR pre-processing not enabled in PDFActivityPack.</w:t>
-            </w:r>
-          </w:p>
-        </w:tc>
-        <w:tc>
-          <w:tcPr>
-            <w:tcW w:type="dxa" w:w="1080"/>
-            <w:shd w:val="clear" w:color="auto" w:fill="d1fae5"/>
-          </w:tcPr>
-          <w:p>
-            <w:pPr>
-              <w:jc w:val="center"/>
-            </w:pPr>
-            <w:r>
-              <w:rPr>
-                <w:b/>
-                <w:color w:val="10B981"/>
-                <w:sz w:val="18"/>
-              </w:rPr>
-              <w:t>LOW</w:t>
-            </w:r>
-          </w:p>
-        </w:tc>
-      </w:tr>
-    </w:tbl>
-    <w:p/>
     <w:p>
       <w:pPr>
-        <w:spacing w:before="240" w:after="120"/>
+        <w:spacing w:before="200" w:after="80"/>
       </w:pPr>
       <w:r>
         <w:rPr>
           <w:b/>
-          <w:color w:val="1A3A5C"/>
-          <w:sz w:val="28"/>
+          <w:color w:val="2563EB"/>
+          <w:sz w:val="26"/>
         </w:rPr>
-        <w:t>Error Type Distribution</w:t>
+        <w:t>E-02 — InvalidOrderDataException</w:t>
       </w:r>
     </w:p>
     <w:p>
       <w:pPr>
-        <w:pStyle w:val="ListBullet"/>
         <w:spacing w:after="40"/>
       </w:pPr>
       <w:r>
         <w:rPr>
-          <w:sz w:val="20"/>
+          <w:b/>
+          <w:sz w:val="21"/>
         </w:rPr>
-        <w:t>System Exceptions (2) — E-01, E-03: Infrastructure failures: stale UI selector and database query timeout under concurrency.</w:t>
+        <w:t xml:space="preserve">Type: </w:t>
+      </w:r>
+      <w:r>
+        <w:rPr>
+          <w:sz w:val="21"/>
+        </w:rPr>
+        <w:t>Business</w:t>
       </w:r>
     </w:p>
     <w:p>
       <w:pPr>
-        <w:pStyle w:val="ListBullet"/>
         <w:spacing w:after="40"/>
       </w:pPr>
       <w:r>
         <w:rPr>
-          <w:sz w:val="20"/>
+          <w:b/>
+          <w:sz w:val="21"/>
         </w:rPr>
-        <w:t>Business Exceptions (2) — E-02, E-04: Data and logic failures: invalid input data and missing idempotency in retry logic.</w:t>
+        <w:t xml:space="preserve">Stage: </w:t>
+      </w:r>
+      <w:r>
+        <w:rPr>
+          <w:sz w:val="21"/>
+        </w:rPr>
+        <w:t>Data Extraction</w:t>
       </w:r>
     </w:p>
     <w:p>
       <w:pPr>
-        <w:pStyle w:val="ListBullet"/>
         <w:spacing w:after="40"/>
       </w:pPr>
       <w:r>
         <w:rPr>
-          <w:sz w:val="20"/>
+          <w:b/>
+          <w:sz w:val="21"/>
         </w:rPr>
-        <w:t>Application Exceptions (1) — E-05: Parser failure: vendor PDF format change from text-layer to rasterized scanned image.</w:t>
+        <w:t xml:space="preserve">Severity: </w:t>
+      </w:r>
+      <w:r>
+        <w:rPr>
+          <w:sz w:val="21"/>
+        </w:rPr>
+        <w:t>HIGH</w:t>
+      </w:r>
+    </w:p>
+    <w:p>
+      <w:pPr>
+        <w:spacing w:after="80"/>
+      </w:pPr>
+      <w:r>
+        <w:rPr>
+          <w:sz w:val="21"/>
+        </w:rPr>
+        <w:t>Root Cause: ERP system began exporting international orders without the postal code field. Input schema validation layer never updated, causing silent shipment failures.</w:t>
+      </w:r>
+    </w:p>
+    <w:p>
+      <w:pPr>
+        <w:spacing w:before="200" w:after="80"/>
+      </w:pPr>
+      <w:r>
+        <w:rPr>
+          <w:b/>
+          <w:color w:val="2563EB"/>
+          <w:sz w:val="26"/>
+        </w:rPr>
+        <w:t>E-03 — OracleDBTimeoutException</w:t>
+      </w:r>
+    </w:p>
+    <w:p>
+      <w:pPr>
+        <w:spacing w:after="40"/>
+      </w:pPr>
+      <w:r>
+        <w:rPr>
+          <w:b/>
+          <w:sz w:val="21"/>
+        </w:rPr>
+        <w:t xml:space="preserve">Type: </w:t>
+      </w:r>
+      <w:r>
+        <w:rPr>
+          <w:sz w:val="21"/>
+        </w:rPr>
+        <w:t>System</w:t>
+      </w:r>
+    </w:p>
+    <w:p>
+      <w:pPr>
+        <w:spacing w:after="40"/>
+      </w:pPr>
+      <w:r>
+        <w:rPr>
+          <w:b/>
+          <w:sz w:val="21"/>
+        </w:rPr>
+        <w:t xml:space="preserve">Stage: </w:t>
+      </w:r>
+      <w:r>
+        <w:rPr>
+          <w:sz w:val="21"/>
+        </w:rPr>
+        <w:t>Inventory Check</w:t>
+      </w:r>
+    </w:p>
+    <w:p>
+      <w:pPr>
+        <w:spacing w:after="40"/>
+      </w:pPr>
+      <w:r>
+        <w:rPr>
+          <w:b/>
+          <w:sz w:val="21"/>
+        </w:rPr>
+        <w:t xml:space="preserve">Severity: </w:t>
+      </w:r>
+      <w:r>
+        <w:rPr>
+          <w:sz w:val="21"/>
+        </w:rPr>
+        <w:t>HIGH</w:t>
+      </w:r>
+    </w:p>
+    <w:p>
+      <w:pPr>
+        <w:spacing w:after="80"/>
+      </w:pPr>
+      <w:r>
+        <w:rPr>
+          <w:sz w:val="21"/>
+        </w:rPr>
+        <w:t>Root Cause: Inventory table lacks composite index on (product_sku, warehouse_id). Full table scans under 50+ concurrent bots caused 30s timeouts, leading to 400+ oversold units/week.</w:t>
+      </w:r>
+    </w:p>
+    <w:p>
+      <w:pPr>
+        <w:spacing w:before="200" w:after="80"/>
+      </w:pPr>
+      <w:r>
+        <w:rPr>
+          <w:b/>
+          <w:color w:val="2563EB"/>
+          <w:sz w:val="26"/>
+        </w:rPr>
+        <w:t>E-04 — DuplicateOrderException</w:t>
+      </w:r>
+    </w:p>
+    <w:p>
+      <w:pPr>
+        <w:spacing w:after="40"/>
+      </w:pPr>
+      <w:r>
+        <w:rPr>
+          <w:b/>
+          <w:sz w:val="21"/>
+        </w:rPr>
+        <w:t xml:space="preserve">Type: </w:t>
+      </w:r>
+      <w:r>
+        <w:rPr>
+          <w:sz w:val="21"/>
+        </w:rPr>
+        <w:t>Business</w:t>
+      </w:r>
+    </w:p>
+    <w:p>
+      <w:pPr>
+        <w:spacing w:after="40"/>
+      </w:pPr>
+      <w:r>
+        <w:rPr>
+          <w:b/>
+          <w:sz w:val="21"/>
+        </w:rPr>
+        <w:t xml:space="preserve">Stage: </w:t>
+      </w:r>
+      <w:r>
+        <w:rPr>
+          <w:sz w:val="21"/>
+        </w:rPr>
+        <w:t>Order Submission</w:t>
+      </w:r>
+    </w:p>
+    <w:p>
+      <w:pPr>
+        <w:spacing w:after="40"/>
+      </w:pPr>
+      <w:r>
+        <w:rPr>
+          <w:b/>
+          <w:sz w:val="21"/>
+        </w:rPr>
+        <w:t xml:space="preserve">Severity: </w:t>
+      </w:r>
+      <w:r>
+        <w:rPr>
+          <w:sz w:val="21"/>
+        </w:rPr>
+        <w:t>MEDIUM</w:t>
+      </w:r>
+    </w:p>
+    <w:p>
+      <w:pPr>
+        <w:spacing w:after="80"/>
+      </w:pPr>
+      <w:r>
+        <w:rPr>
+          <w:sz w:val="21"/>
+        </w:rPr>
+        <w:t>Root Cause: Retry logic lacked idempotency key check. On network timeout, bot retried without verifying if original POST succeeded — creating duplicate records and double-charging customers.</w:t>
+      </w:r>
+    </w:p>
+    <w:p>
+      <w:pPr>
+        <w:spacing w:before="200" w:after="80"/>
+      </w:pPr>
+      <w:r>
+        <w:rPr>
+          <w:b/>
+          <w:color w:val="2563EB"/>
+          <w:sz w:val="26"/>
+        </w:rPr>
+        <w:t>E-05 — PDFParsingFailureException</w:t>
+      </w:r>
+    </w:p>
+    <w:p>
+      <w:pPr>
+        <w:spacing w:after="40"/>
+      </w:pPr>
+      <w:r>
+        <w:rPr>
+          <w:b/>
+          <w:sz w:val="21"/>
+        </w:rPr>
+        <w:t xml:space="preserve">Type: </w:t>
+      </w:r>
+      <w:r>
+        <w:rPr>
+          <w:sz w:val="21"/>
+        </w:rPr>
+        <w:t>App</w:t>
+      </w:r>
+    </w:p>
+    <w:p>
+      <w:pPr>
+        <w:spacing w:after="40"/>
+      </w:pPr>
+      <w:r>
+        <w:rPr>
+          <w:b/>
+          <w:sz w:val="21"/>
+        </w:rPr>
+        <w:t xml:space="preserve">Stage: </w:t>
+      </w:r>
+      <w:r>
+        <w:rPr>
+          <w:sz w:val="21"/>
+        </w:rPr>
+        <w:t>Invoice Generation</w:t>
+      </w:r>
+    </w:p>
+    <w:p>
+      <w:pPr>
+        <w:spacing w:after="40"/>
+      </w:pPr>
+      <w:r>
+        <w:rPr>
+          <w:b/>
+          <w:sz w:val="21"/>
+        </w:rPr>
+        <w:t xml:space="preserve">Severity: </w:t>
+      </w:r>
+      <w:r>
+        <w:rPr>
+          <w:sz w:val="21"/>
+        </w:rPr>
+        <w:t>LOW</w:t>
+      </w:r>
+    </w:p>
+    <w:p>
+      <w:pPr>
+        <w:spacing w:after="80"/>
+      </w:pPr>
+      <w:r>
+        <w:rPr>
+          <w:sz w:val="21"/>
+        </w:rPr>
+        <w:t>Root Cause: Vendor switched invoice template from text-layer PDF to scanned image PDF. OCR pre-processing not enabled in PDFActivityPack — parser returned null fields.</w:t>
       </w:r>
     </w:p>
     <w:sectPr>
-      <w:pgSz w:w="15840" w:h="12240"/>
-      <w:pgMar w:top="1008" w:right="1152" w:bottom="1008" w:left="1152" w:header="720" w:footer="720" w:gutter="0"/>
+      <w:pgSz w:w="12240" w:h="15840"/>
+      <w:pgMar w:top="1224" w:right="1224" w:bottom="1224" w:left="1224" w:header="720" w:footer="720" w:gutter="0"/>
       <w:cols w:space="720"/>
       <w:docGrid w:linePitch="360"/>
     </w:sectPr>

</xml_diff>